<commit_message>
Apply writing rules: eliminate em-dashes across all book prose; add STYLE.md
- Replace every em-dash with a comma, semicolon, or hyphen as the
  sentence requires; chapters hand-edited, structural files (TOC,
  indexes, worklist) converted to hyphen separators
- Add book/STYLE.md codifying the house writing rules (no em-dashes,
  bolded hook sentence per chapter, standalone chapters, accuracy and
  citation-verification rules) so future chapters follow them
- Regenerate all Word documents and the master manuscript

Co-Authored-By: Claude Opus 4.8 <noreply@anthropic.com>
Claude-Session: https://claude.ai/code/session_016HAHAXcMmaZghEz1kJrDWU
</commit_message>
<xml_diff>
--- a/book/word/Ch09 - The Test Drive.docx
+++ b/book/word/Ch09 - The Test Drive.docx
@@ -2,13 +2,13 @@
 <file path=word/document.xml><?xml version="1.0" encoding="utf-8"?>
 <w:document xmlns:w="http://schemas.openxmlformats.org/wordprocessingml/2006/main" xmlns:m="http://schemas.openxmlformats.org/officeDocument/2006/math" xmlns:r="http://schemas.openxmlformats.org/officeDocument/2006/relationships" xmlns:o="urn:schemas-microsoft-com:office:office" xmlns:v="urn:schemas-microsoft-com:vml" xmlns:w10="urn:schemas-microsoft-com:office:word" xmlns:a="http://schemas.openxmlformats.org/drawingml/2006/main" xmlns:pic="http://schemas.openxmlformats.org/drawingml/2006/picture" xmlns:wp="http://schemas.openxmlformats.org/drawingml/2006/wordprocessingDrawing">
   <w:body>
-    <w:bookmarkStart w:id="25" w:name="chapter-9-the-test-drive"/>
+    <w:bookmarkStart w:id="25" w:name="chapter-9---the-test-drive"/>
     <w:p>
       <w:pPr>
         <w:pStyle w:val="Heading1"/>
       </w:pPr>
       <w:r>
-        <w:t xml:space="preserve">Chapter 9 — The Test Drive</w:t>
+        <w:t xml:space="preserve">Chapter 9 - The Test Drive</w:t>
       </w:r>
     </w:p>
     <w:p>
@@ -74,7 +74,7 @@
         <w:pStyle w:val="BodyText"/>
       </w:pPr>
       <w:r>
-        <w:t xml:space="preserve">Two men arrived. The three of them went for a test drive — Dellen Millard</w:t>
+        <w:t xml:space="preserve">Two men arrived. The three of them went for a test drive; Dellen Millard</w:t>
       </w:r>
       <w:r>
         <w:t xml:space="preserve"> </w:t>
@@ -108,7 +108,7 @@
         <w:t xml:space="preserve"> </w:t>
       </w:r>
       <w:r>
-        <w:t xml:space="preserve">final step of a plan that had been months in the making — a plan that needed a</w:t>
+        <w:t xml:space="preserve">final step of a plan that had been months in the making; a plan that needed a</w:t>
       </w:r>
       <w:r>
         <w:t xml:space="preserve"> </w:t>
@@ -166,16 +166,13 @@
         <w:t xml:space="preserve">”</w:t>
       </w:r>
       <w:r>
-        <w:t xml:space="preserve"> </w:t>
-      </w:r>
-      <w:r>
-        <w:t xml:space="preserve">— to steal a truck. The same messages showed them</w:t>
-      </w:r>
-      <w:r>
-        <w:t xml:space="preserve"> </w:t>
-      </w:r>
-      <w:r>
-        <w:t xml:space="preserve">discussing the acquisition and preparation of something else: a ten-foot-tall</w:t>
+        <w:t xml:space="preserve">: to steal a truck. The same messages showed them</w:t>
+      </w:r>
+      <w:r>
+        <w:t xml:space="preserve"> </w:t>
+      </w:r>
+      <w:r>
+        <w:t xml:space="preserve">discussing the acquisition and preparation of something else, a ten-foot-tall</w:t>
       </w:r>
       <w:r>
         <w:t xml:space="preserve"> </w:t>
@@ -273,7 +270,7 @@
         <w:t xml:space="preserve"> </w:t>
       </w:r>
       <w:r>
-        <w:t xml:space="preserve">classified ad — because he had what the mission required, and because he would</w:t>
+        <w:t xml:space="preserve">classified ad; because he had what the mission required, and because he would</w:t>
       </w:r>
       <w:r>
         <w:t xml:space="preserve"> </w:t>
@@ -352,13 +349,13 @@
         <w:t xml:space="preserve"> </w:t>
       </w:r>
       <w:r>
-        <w:t xml:space="preserve">mother. His blood was spattered through the cabin; the passenger-side window —</w:t>
-      </w:r>
-      <w:r>
-        <w:t xml:space="preserve"> </w:t>
-      </w:r>
-      <w:r>
-        <w:t xml:space="preserve">Tim’s window — was broken. Millard’s fingerprints were on the rear-view mirror</w:t>
+        <w:t xml:space="preserve">mother. His blood was spattered through the cabin; the passenger-side window,</w:t>
+      </w:r>
+      <w:r>
+        <w:t xml:space="preserve"> </w:t>
+      </w:r>
+      <w:r>
+        <w:t xml:space="preserve">Tim’s window, was broken. Millard’s fingerprints were on the rear-view mirror</w:t>
       </w:r>
       <w:r>
         <w:t xml:space="preserve"> </w:t>
@@ -416,7 +413,7 @@
         <w:t xml:space="preserve"> </w:t>
       </w:r>
       <w:r>
-        <w:t xml:space="preserve">onto Smich — letters that became their own battleground at trial.</w:t>
+        <w:t xml:space="preserve">onto Smich; letters that became their own battleground at trial.</w:t>
       </w:r>
     </w:p>
     <w:bookmarkEnd w:id="21"/>
@@ -440,7 +437,7 @@
         <w:t xml:space="preserve"> </w:t>
       </w:r>
       <w:r>
-        <w:t xml:space="preserve">turned on each other — what the judgment calls</w:t>
+        <w:t xml:space="preserve">turned on each other; what the judgment calls</w:t>
       </w:r>
       <w:r>
         <w:t xml:space="preserve"> </w:t>
@@ -514,7 +511,7 @@
         <w:t xml:space="preserve"> </w:t>
       </w:r>
       <w:r>
-        <w:t xml:space="preserve">For the trial judge, the duel of co-accused had been a procedural minefield —</w:t>
+        <w:t xml:space="preserve">For the trial judge, the duel of co-accused had been a procedural minefield;</w:t>
       </w:r>
       <w:r>
         <w:t xml:space="preserve"> </w:t>
@@ -526,7 +523,7 @@
         <w:t xml:space="preserve"> </w:t>
       </w:r>
       <w:r>
-        <w:t xml:space="preserve">inflammatory closings — and it is that minefield, not the facts, that the</w:t>
+        <w:t xml:space="preserve">inflammatory closings. And it is that minefield, not the facts, that the</w:t>
       </w:r>
       <w:r>
         <w:t xml:space="preserve"> </w:t>
@@ -592,7 +589,7 @@
         <w:t xml:space="preserve"> </w:t>
       </w:r>
       <w:r>
-        <w:t xml:space="preserve">of the gun, the discussions of the Eliminator — a premeditated murder</w:t>
+        <w:t xml:space="preserve">of the gun, the discussions of the Eliminator; a premeditated murder</w:t>
       </w:r>
       <w:r>
         <w:t xml:space="preserve"> </w:t>
@@ -748,7 +745,7 @@
         <w:t xml:space="preserve">R. v. Millard</w:t>
       </w:r>
       <w:r>
-        <w:t xml:space="preserve">, 2023 ONCA 426 — Chapter 10).</w:t>
+        <w:t xml:space="preserve">, 2023 ONCA 426 - Chapter 10).</w:t>
       </w:r>
     </w:p>
     <w:bookmarkEnd w:id="24"/>

</xml_diff>